<commit_message>
Businessplan: Durchschnittserloes von 600 Euro hergeleitet
Die Zahl stand bisher unbelegt in der Kalkulation. Neu ist eine Tabelle mit
dem angenommenen Auftragsmix je zehn Auftraege, aus dem sich 608 Euro ergeben,
abgerundet auf 600. Angesetzt ist jeweils die Mitte der Preisspanne; die
Datenbereinigung bleibt unberuecksichtigt.

Co-Authored-By: Claude Opus 5 <noreply@anthropic.com>
Claude-Session: https://claude.ai/code/session_01ECQV3LX17FPwV9aCb3VGtx
</commit_message>
<xml_diff>
--- a/erechnung/jobcenter/Businessplan-E-Rechnung-IHK.docx
+++ b/erechnung/jobcenter/Businessplan-E-Rechnung-IHK.docx
@@ -1300,6 +1300,625 @@
     </w:p>
     <w:p>
       <w:pPr>
+        <w:spacing w:after="60"/>
+      </w:pPr>
+    </w:p>
+    <w:p>
+      <w:pPr>
+        <w:pStyle w:val="Heading2"/>
+        <w:spacing w:after="120" w:before="240"/>
+      </w:pPr>
+      <w:r>
+        <w:rPr>
+          <w:rFonts w:ascii="Arial" w:cs="Arial" w:eastAsia="Arial" w:hAnsi="Arial"/>
+          <w:b/>
+          <w:bCs/>
+          <w:sz w:val="23"/>
+          <w:szCs w:val="23"/>
+        </w:rPr>
+        <w:t xml:space="preserve">Herleitung des Durchschnittserlöses</w:t>
+      </w:r>
+    </w:p>
+    <w:p>
+      <w:pPr>
+        <w:spacing w:after="120" w:line="276"/>
+      </w:pPr>
+      <w:r>
+        <w:rPr>
+          <w:rFonts w:ascii="Arial" w:cs="Arial" w:eastAsia="Arial" w:hAnsi="Arial"/>
+          <w:sz w:val="21"/>
+          <w:szCs w:val="21"/>
+        </w:rPr>
+        <w:t xml:space="preserve">Die Vorschau rechnet nicht mit einem einzelnen Preis, sondern mit einem angenommenen Auftragsmix. Je zehn Aufträge wird unterstellt:</w:t>
+      </w:r>
+    </w:p>
+    <w:tbl>
+      <w:tblPr>
+        <w:tblW w:type="dxa" w:w="9070"/>
+        <w:tblBorders>
+          <w:top w:val="single" w:color="C9C7BE" w:sz="2"/>
+          <w:left w:val="single" w:color="C9C7BE" w:sz="2"/>
+          <w:bottom w:val="single" w:color="C9C7BE" w:sz="2"/>
+          <w:right w:val="single" w:color="C9C7BE" w:sz="2"/>
+          <w:insideH w:val="single" w:color="C9C7BE" w:sz="2"/>
+          <w:insideV w:val="single" w:color="C9C7BE" w:sz="2"/>
+        </w:tblBorders>
+      </w:tblPr>
+      <w:tblGrid>
+        <w:gridCol w:w="2600"/>
+        <w:gridCol w:w="1500"/>
+        <w:gridCol w:w="2470"/>
+        <w:gridCol w:w="2500"/>
+      </w:tblGrid>
+      <w:tr>
+        <w:trPr>
+          <w:tblHeader/>
+        </w:trPr>
+        <w:tc>
+          <w:tcPr>
+            <w:tcW w:type="dxa" w:w="2600"/>
+            <w:shd w:fill="0E5B50" w:color="auto" w:val="clear"/>
+            <w:tcMar>
+              <w:top w:type="dxa" w:w="80"/>
+              <w:left w:type="dxa" w:w="110"/>
+              <w:bottom w:type="dxa" w:w="80"/>
+              <w:right w:type="dxa" w:w="110"/>
+            </w:tcMar>
+          </w:tcPr>
+          <w:p>
+            <w:pPr>
+              <w:spacing w:after="0" w:line="260"/>
+              <w:jc w:val="left"/>
+            </w:pPr>
+            <w:r>
+              <w:rPr>
+                <w:rFonts w:ascii="Arial" w:cs="Arial" w:eastAsia="Arial" w:hAnsi="Arial"/>
+                <w:b/>
+                <w:bCs/>
+                <w:color w:val="FFFFFF"/>
+                <w:sz w:val="19"/>
+                <w:szCs w:val="19"/>
+              </w:rPr>
+              <w:t xml:space="preserve">Paket</w:t>
+            </w:r>
+          </w:p>
+        </w:tc>
+        <w:tc>
+          <w:tcPr>
+            <w:tcW w:type="dxa" w:w="1500"/>
+            <w:shd w:fill="0E5B50" w:color="auto" w:val="clear"/>
+            <w:tcMar>
+              <w:top w:type="dxa" w:w="80"/>
+              <w:left w:type="dxa" w:w="110"/>
+              <w:bottom w:type="dxa" w:w="80"/>
+              <w:right w:type="dxa" w:w="110"/>
+            </w:tcMar>
+          </w:tcPr>
+          <w:p>
+            <w:pPr>
+              <w:spacing w:after="0" w:line="260"/>
+              <w:jc w:val="left"/>
+            </w:pPr>
+            <w:r>
+              <w:rPr>
+                <w:rFonts w:ascii="Arial" w:cs="Arial" w:eastAsia="Arial" w:hAnsi="Arial"/>
+                <w:b/>
+                <w:bCs/>
+                <w:color w:val="FFFFFF"/>
+                <w:sz w:val="19"/>
+                <w:szCs w:val="19"/>
+              </w:rPr>
+              <w:t xml:space="preserve">Anteil</w:t>
+            </w:r>
+          </w:p>
+        </w:tc>
+        <w:tc>
+          <w:tcPr>
+            <w:tcW w:type="dxa" w:w="2470"/>
+            <w:shd w:fill="0E5B50" w:color="auto" w:val="clear"/>
+            <w:tcMar>
+              <w:top w:type="dxa" w:w="80"/>
+              <w:left w:type="dxa" w:w="110"/>
+              <w:bottom w:type="dxa" w:w="80"/>
+              <w:right w:type="dxa" w:w="110"/>
+            </w:tcMar>
+          </w:tcPr>
+          <w:p>
+            <w:pPr>
+              <w:spacing w:after="0" w:line="260"/>
+              <w:jc w:val="left"/>
+            </w:pPr>
+            <w:r>
+              <w:rPr>
+                <w:rFonts w:ascii="Arial" w:cs="Arial" w:eastAsia="Arial" w:hAnsi="Arial"/>
+                <w:b/>
+                <w:bCs/>
+                <w:color w:val="FFFFFF"/>
+                <w:sz w:val="19"/>
+                <w:szCs w:val="19"/>
+              </w:rPr>
+              <w:t xml:space="preserve">Angesetzt</w:t>
+            </w:r>
+          </w:p>
+        </w:tc>
+        <w:tc>
+          <w:tcPr>
+            <w:tcW w:type="dxa" w:w="2500"/>
+            <w:shd w:fill="0E5B50" w:color="auto" w:val="clear"/>
+            <w:tcMar>
+              <w:top w:type="dxa" w:w="80"/>
+              <w:left w:type="dxa" w:w="110"/>
+              <w:bottom w:type="dxa" w:w="80"/>
+              <w:right w:type="dxa" w:w="110"/>
+            </w:tcMar>
+          </w:tcPr>
+          <w:p>
+            <w:pPr>
+              <w:spacing w:after="0" w:line="260"/>
+              <w:jc w:val="left"/>
+            </w:pPr>
+            <w:r>
+              <w:rPr>
+                <w:rFonts w:ascii="Arial" w:cs="Arial" w:eastAsia="Arial" w:hAnsi="Arial"/>
+                <w:b/>
+                <w:bCs/>
+                <w:color w:val="FFFFFF"/>
+                <w:sz w:val="19"/>
+                <w:szCs w:val="19"/>
+              </w:rPr>
+              <w:t xml:space="preserve">Erlös</w:t>
+            </w:r>
+          </w:p>
+        </w:tc>
+      </w:tr>
+      <w:tr>
+        <w:tc>
+          <w:tcPr>
+            <w:tcW w:type="dxa" w:w="2600"/>
+            <w:tcMar>
+              <w:top w:type="dxa" w:w="80"/>
+              <w:left w:type="dxa" w:w="110"/>
+              <w:bottom w:type="dxa" w:w="80"/>
+              <w:right w:type="dxa" w:w="110"/>
+            </w:tcMar>
+          </w:tcPr>
+          <w:p>
+            <w:pPr>
+              <w:spacing w:after="0" w:line="260"/>
+              <w:jc w:val="left"/>
+            </w:pPr>
+            <w:r>
+              <w:rPr>
+                <w:rFonts w:ascii="Arial" w:cs="Arial" w:eastAsia="Arial" w:hAnsi="Arial"/>
+                <w:b/>
+                <w:bCs/>
+                <w:sz w:val="20"/>
+                <w:szCs w:val="20"/>
+              </w:rPr>
+              <w:t xml:space="preserve">Einrichtung Standard</w:t>
+            </w:r>
+          </w:p>
+        </w:tc>
+        <w:tc>
+          <w:tcPr>
+            <w:tcW w:type="dxa" w:w="1500"/>
+            <w:tcMar>
+              <w:top w:type="dxa" w:w="80"/>
+              <w:left w:type="dxa" w:w="110"/>
+              <w:bottom w:type="dxa" w:w="80"/>
+              <w:right w:type="dxa" w:w="110"/>
+            </w:tcMar>
+          </w:tcPr>
+          <w:p>
+            <w:pPr>
+              <w:spacing w:after="0" w:line="260"/>
+              <w:jc w:val="left"/>
+            </w:pPr>
+            <w:r>
+              <w:rPr>
+                <w:rFonts w:ascii="Arial" w:cs="Arial" w:eastAsia="Arial" w:hAnsi="Arial"/>
+                <w:b w:val="false"/>
+                <w:bCs w:val="false"/>
+                <w:sz w:val="20"/>
+                <w:szCs w:val="20"/>
+              </w:rPr>
+              <w:t xml:space="preserve">6 von 10</w:t>
+            </w:r>
+          </w:p>
+        </w:tc>
+        <w:tc>
+          <w:tcPr>
+            <w:tcW w:type="dxa" w:w="2470"/>
+            <w:tcMar>
+              <w:top w:type="dxa" w:w="80"/>
+              <w:left w:type="dxa" w:w="110"/>
+              <w:bottom w:type="dxa" w:w="80"/>
+              <w:right w:type="dxa" w:w="110"/>
+            </w:tcMar>
+          </w:tcPr>
+          <w:p>
+            <w:pPr>
+              <w:spacing w:after="0" w:line="260"/>
+              <w:jc w:val="left"/>
+            </w:pPr>
+            <w:r>
+              <w:rPr>
+                <w:rFonts w:ascii="Arial" w:cs="Arial" w:eastAsia="Arial" w:hAnsi="Arial"/>
+                <w:b w:val="false"/>
+                <w:bCs w:val="false"/>
+                <w:sz w:val="20"/>
+                <w:szCs w:val="20"/>
+              </w:rPr>
+              <w:t xml:space="preserve">550 €</w:t>
+            </w:r>
+          </w:p>
+        </w:tc>
+        <w:tc>
+          <w:tcPr>
+            <w:tcW w:type="dxa" w:w="2500"/>
+            <w:tcMar>
+              <w:top w:type="dxa" w:w="80"/>
+              <w:left w:type="dxa" w:w="110"/>
+              <w:bottom w:type="dxa" w:w="80"/>
+              <w:right w:type="dxa" w:w="110"/>
+            </w:tcMar>
+          </w:tcPr>
+          <w:p>
+            <w:pPr>
+              <w:spacing w:after="0" w:line="260"/>
+              <w:jc w:val="left"/>
+            </w:pPr>
+            <w:r>
+              <w:rPr>
+                <w:rFonts w:ascii="Arial" w:cs="Arial" w:eastAsia="Arial" w:hAnsi="Arial"/>
+                <w:b w:val="false"/>
+                <w:bCs w:val="false"/>
+                <w:sz w:val="20"/>
+                <w:szCs w:val="20"/>
+              </w:rPr>
+              <w:t xml:space="preserve">3.300 €</w:t>
+            </w:r>
+          </w:p>
+        </w:tc>
+      </w:tr>
+      <w:tr>
+        <w:tc>
+          <w:tcPr>
+            <w:tcW w:type="dxa" w:w="2600"/>
+            <w:tcMar>
+              <w:top w:type="dxa" w:w="80"/>
+              <w:left w:type="dxa" w:w="110"/>
+              <w:bottom w:type="dxa" w:w="80"/>
+              <w:right w:type="dxa" w:w="110"/>
+            </w:tcMar>
+          </w:tcPr>
+          <w:p>
+            <w:pPr>
+              <w:spacing w:after="0" w:line="260"/>
+              <w:jc w:val="left"/>
+            </w:pPr>
+            <w:r>
+              <w:rPr>
+                <w:rFonts w:ascii="Arial" w:cs="Arial" w:eastAsia="Arial" w:hAnsi="Arial"/>
+                <w:b/>
+                <w:bCs/>
+                <w:sz w:val="20"/>
+                <w:szCs w:val="20"/>
+              </w:rPr>
+              <w:t xml:space="preserve">Umstieg</w:t>
+            </w:r>
+          </w:p>
+        </w:tc>
+        <w:tc>
+          <w:tcPr>
+            <w:tcW w:type="dxa" w:w="1500"/>
+            <w:tcMar>
+              <w:top w:type="dxa" w:w="80"/>
+              <w:left w:type="dxa" w:w="110"/>
+              <w:bottom w:type="dxa" w:w="80"/>
+              <w:right w:type="dxa" w:w="110"/>
+            </w:tcMar>
+          </w:tcPr>
+          <w:p>
+            <w:pPr>
+              <w:spacing w:after="0" w:line="260"/>
+              <w:jc w:val="left"/>
+            </w:pPr>
+            <w:r>
+              <w:rPr>
+                <w:rFonts w:ascii="Arial" w:cs="Arial" w:eastAsia="Arial" w:hAnsi="Arial"/>
+                <w:b w:val="false"/>
+                <w:bCs w:val="false"/>
+                <w:sz w:val="20"/>
+                <w:szCs w:val="20"/>
+              </w:rPr>
+              <w:t xml:space="preserve">2 von 10</w:t>
+            </w:r>
+          </w:p>
+        </w:tc>
+        <w:tc>
+          <w:tcPr>
+            <w:tcW w:type="dxa" w:w="2470"/>
+            <w:tcMar>
+              <w:top w:type="dxa" w:w="80"/>
+              <w:left w:type="dxa" w:w="110"/>
+              <w:bottom w:type="dxa" w:w="80"/>
+              <w:right w:type="dxa" w:w="110"/>
+            </w:tcMar>
+          </w:tcPr>
+          <w:p>
+            <w:pPr>
+              <w:spacing w:after="0" w:line="260"/>
+              <w:jc w:val="left"/>
+            </w:pPr>
+            <w:r>
+              <w:rPr>
+                <w:rFonts w:ascii="Arial" w:cs="Arial" w:eastAsia="Arial" w:hAnsi="Arial"/>
+                <w:b w:val="false"/>
+                <w:bCs w:val="false"/>
+                <w:sz w:val="20"/>
+                <w:szCs w:val="20"/>
+              </w:rPr>
+              <w:t xml:space="preserve">1.150 €</w:t>
+            </w:r>
+          </w:p>
+        </w:tc>
+        <w:tc>
+          <w:tcPr>
+            <w:tcW w:type="dxa" w:w="2500"/>
+            <w:tcMar>
+              <w:top w:type="dxa" w:w="80"/>
+              <w:left w:type="dxa" w:w="110"/>
+              <w:bottom w:type="dxa" w:w="80"/>
+              <w:right w:type="dxa" w:w="110"/>
+            </w:tcMar>
+          </w:tcPr>
+          <w:p>
+            <w:pPr>
+              <w:spacing w:after="0" w:line="260"/>
+              <w:jc w:val="left"/>
+            </w:pPr>
+            <w:r>
+              <w:rPr>
+                <w:rFonts w:ascii="Arial" w:cs="Arial" w:eastAsia="Arial" w:hAnsi="Arial"/>
+                <w:b w:val="false"/>
+                <w:bCs w:val="false"/>
+                <w:sz w:val="20"/>
+                <w:szCs w:val="20"/>
+              </w:rPr>
+              <w:t xml:space="preserve">2.300 €</w:t>
+            </w:r>
+          </w:p>
+        </w:tc>
+      </w:tr>
+      <w:tr>
+        <w:tc>
+          <w:tcPr>
+            <w:tcW w:type="dxa" w:w="2600"/>
+            <w:tcMar>
+              <w:top w:type="dxa" w:w="80"/>
+              <w:left w:type="dxa" w:w="110"/>
+              <w:bottom w:type="dxa" w:w="80"/>
+              <w:right w:type="dxa" w:w="110"/>
+            </w:tcMar>
+          </w:tcPr>
+          <w:p>
+            <w:pPr>
+              <w:spacing w:after="0" w:line="260"/>
+              <w:jc w:val="left"/>
+            </w:pPr>
+            <w:r>
+              <w:rPr>
+                <w:rFonts w:ascii="Arial" w:cs="Arial" w:eastAsia="Arial" w:hAnsi="Arial"/>
+                <w:b/>
+                <w:bCs/>
+                <w:sz w:val="20"/>
+                <w:szCs w:val="20"/>
+              </w:rPr>
+              <w:t xml:space="preserve">Nur Empfang</w:t>
+            </w:r>
+          </w:p>
+        </w:tc>
+        <w:tc>
+          <w:tcPr>
+            <w:tcW w:type="dxa" w:w="1500"/>
+            <w:tcMar>
+              <w:top w:type="dxa" w:w="80"/>
+              <w:left w:type="dxa" w:w="110"/>
+              <w:bottom w:type="dxa" w:w="80"/>
+              <w:right w:type="dxa" w:w="110"/>
+            </w:tcMar>
+          </w:tcPr>
+          <w:p>
+            <w:pPr>
+              <w:spacing w:after="0" w:line="260"/>
+              <w:jc w:val="left"/>
+            </w:pPr>
+            <w:r>
+              <w:rPr>
+                <w:rFonts w:ascii="Arial" w:cs="Arial" w:eastAsia="Arial" w:hAnsi="Arial"/>
+                <w:b w:val="false"/>
+                <w:bCs w:val="false"/>
+                <w:sz w:val="20"/>
+                <w:szCs w:val="20"/>
+              </w:rPr>
+              <w:t xml:space="preserve">2 von 10</w:t>
+            </w:r>
+          </w:p>
+        </w:tc>
+        <w:tc>
+          <w:tcPr>
+            <w:tcW w:type="dxa" w:w="2470"/>
+            <w:tcMar>
+              <w:top w:type="dxa" w:w="80"/>
+              <w:left w:type="dxa" w:w="110"/>
+              <w:bottom w:type="dxa" w:w="80"/>
+              <w:right w:type="dxa" w:w="110"/>
+            </w:tcMar>
+          </w:tcPr>
+          <w:p>
+            <w:pPr>
+              <w:spacing w:after="0" w:line="260"/>
+              <w:jc w:val="left"/>
+            </w:pPr>
+            <w:r>
+              <w:rPr>
+                <w:rFonts w:ascii="Arial" w:cs="Arial" w:eastAsia="Arial" w:hAnsi="Arial"/>
+                <w:b w:val="false"/>
+                <w:bCs w:val="false"/>
+                <w:sz w:val="20"/>
+                <w:szCs w:val="20"/>
+              </w:rPr>
+              <w:t xml:space="preserve">240 €</w:t>
+            </w:r>
+          </w:p>
+        </w:tc>
+        <w:tc>
+          <w:tcPr>
+            <w:tcW w:type="dxa" w:w="2500"/>
+            <w:tcMar>
+              <w:top w:type="dxa" w:w="80"/>
+              <w:left w:type="dxa" w:w="110"/>
+              <w:bottom w:type="dxa" w:w="80"/>
+              <w:right w:type="dxa" w:w="110"/>
+            </w:tcMar>
+          </w:tcPr>
+          <w:p>
+            <w:pPr>
+              <w:spacing w:after="0" w:line="260"/>
+              <w:jc w:val="left"/>
+            </w:pPr>
+            <w:r>
+              <w:rPr>
+                <w:rFonts w:ascii="Arial" w:cs="Arial" w:eastAsia="Arial" w:hAnsi="Arial"/>
+                <w:b w:val="false"/>
+                <w:bCs w:val="false"/>
+                <w:sz w:val="20"/>
+                <w:szCs w:val="20"/>
+              </w:rPr>
+              <w:t xml:space="preserve">480 €</w:t>
+            </w:r>
+          </w:p>
+        </w:tc>
+      </w:tr>
+      <w:tr>
+        <w:tc>
+          <w:tcPr>
+            <w:tcW w:type="dxa" w:w="2600"/>
+            <w:tcMar>
+              <w:top w:type="dxa" w:w="80"/>
+              <w:left w:type="dxa" w:w="110"/>
+              <w:bottom w:type="dxa" w:w="80"/>
+              <w:right w:type="dxa" w:w="110"/>
+            </w:tcMar>
+          </w:tcPr>
+          <w:p>
+            <w:pPr>
+              <w:spacing w:after="0" w:line="260"/>
+              <w:jc w:val="left"/>
+            </w:pPr>
+            <w:r>
+              <w:rPr>
+                <w:rFonts w:ascii="Arial" w:cs="Arial" w:eastAsia="Arial" w:hAnsi="Arial"/>
+                <w:b/>
+                <w:bCs/>
+                <w:sz w:val="20"/>
+                <w:szCs w:val="20"/>
+              </w:rPr>
+              <w:t xml:space="preserve">Summe je zehn Aufträge</w:t>
+            </w:r>
+          </w:p>
+        </w:tc>
+        <w:tc>
+          <w:tcPr>
+            <w:tcW w:type="dxa" w:w="1500"/>
+            <w:tcMar>
+              <w:top w:type="dxa" w:w="80"/>
+              <w:left w:type="dxa" w:w="110"/>
+              <w:bottom w:type="dxa" w:w="80"/>
+              <w:right w:type="dxa" w:w="110"/>
+            </w:tcMar>
+          </w:tcPr>
+          <w:p>
+            <w:pPr>
+              <w:spacing w:after="0" w:line="260"/>
+              <w:jc w:val="left"/>
+            </w:pPr>
+            <w:r>
+              <w:rPr>
+                <w:rFonts w:ascii="Arial" w:cs="Arial" w:eastAsia="Arial" w:hAnsi="Arial"/>
+                <w:b w:val="false"/>
+                <w:bCs w:val="false"/>
+                <w:sz w:val="20"/>
+                <w:szCs w:val="20"/>
+              </w:rPr>
+              <w:t xml:space="preserve"/>
+            </w:r>
+          </w:p>
+        </w:tc>
+        <w:tc>
+          <w:tcPr>
+            <w:tcW w:type="dxa" w:w="2470"/>
+            <w:tcMar>
+              <w:top w:type="dxa" w:w="80"/>
+              <w:left w:type="dxa" w:w="110"/>
+              <w:bottom w:type="dxa" w:w="80"/>
+              <w:right w:type="dxa" w:w="110"/>
+            </w:tcMar>
+          </w:tcPr>
+          <w:p>
+            <w:pPr>
+              <w:spacing w:after="0" w:line="260"/>
+              <w:jc w:val="left"/>
+            </w:pPr>
+            <w:r>
+              <w:rPr>
+                <w:rFonts w:ascii="Arial" w:cs="Arial" w:eastAsia="Arial" w:hAnsi="Arial"/>
+                <w:b w:val="false"/>
+                <w:bCs w:val="false"/>
+                <w:sz w:val="20"/>
+                <w:szCs w:val="20"/>
+              </w:rPr>
+              <w:t xml:space="preserve"/>
+            </w:r>
+          </w:p>
+        </w:tc>
+        <w:tc>
+          <w:tcPr>
+            <w:tcW w:type="dxa" w:w="2500"/>
+            <w:tcMar>
+              <w:top w:type="dxa" w:w="80"/>
+              <w:left w:type="dxa" w:w="110"/>
+              <w:bottom w:type="dxa" w:w="80"/>
+              <w:right w:type="dxa" w:w="110"/>
+            </w:tcMar>
+          </w:tcPr>
+          <w:p>
+            <w:pPr>
+              <w:spacing w:after="0" w:line="260"/>
+              <w:jc w:val="left"/>
+            </w:pPr>
+            <w:r>
+              <w:rPr>
+                <w:rFonts w:ascii="Arial" w:cs="Arial" w:eastAsia="Arial" w:hAnsi="Arial"/>
+                <w:b w:val="false"/>
+                <w:bCs w:val="false"/>
+                <w:sz w:val="20"/>
+                <w:szCs w:val="20"/>
+              </w:rPr>
+              <w:t xml:space="preserve">6.080 €</w:t>
+            </w:r>
+          </w:p>
+        </w:tc>
+      </w:tr>
+    </w:tbl>
+    <w:p>
+      <w:pPr>
+        <w:spacing w:after="80"/>
+      </w:pPr>
+    </w:p>
+    <w:p>
+      <w:pPr>
         <w:spacing w:after="120" w:line="276"/>
       </w:pPr>
       <w:r>
@@ -1311,7 +1930,7 @@
           <w:sz w:val="21"/>
           <w:szCs w:val="21"/>
         </w:rPr>
-        <w:t xml:space="preserve">In der Kalkulation wird durchgehend mit einem vorsichtig angesetzten Durchschnittserlös von 600 Euro je Auftrag gerechnet.</w:t>
+        <w:t xml:space="preserve">Daraus ergibt sich ein Durchschnittserlös von 608 Euro. In der Vorschau wird auf 600 Euro abgerundet. Angesetzt ist jeweils die Mitte der Preisspanne, nicht der obere Rand. Die Zusatzleistung Datenbereinigung bleibt vollständig unberücksichtigt, obwohl sie erfahrungsgemäß bei einem Teil der Aufträge anfällt.</w:t>
       </w:r>
     </w:p>
     <w:p>

</xml_diff>

<commit_message>
Businessplan: steigenden Durchschnittserloes in Jahr 2 und 3 erklaert
Die Drei-Jahres-Vorschau rechnet mit 600, 620 und 640 Euro je Auftrag. Der
Anstieg stand unerklaert da und haette bei der Durchsicht zurueckkommen
muessen. Ergaenzt ist die Begruendung ueber den Auftragsmix.

Co-Authored-By: Claude Opus 5 <noreply@anthropic.com>
Claude-Session: https://claude.ai/code/session_01ECQV3LX17FPwV9aCb3VGtx
</commit_message>
<xml_diff>
--- a/erechnung/jobcenter/Businessplan-E-Rechnung-IHK.docx
+++ b/erechnung/jobcenter/Businessplan-E-Rechnung-IHK.docx
@@ -5133,6 +5133,27 @@
         </w:tc>
       </w:tr>
     </w:tbl>
+    <w:p>
+      <w:pPr>
+        <w:spacing w:after="80"/>
+      </w:pPr>
+    </w:p>
+    <w:p>
+      <w:pPr>
+        <w:spacing w:after="120" w:line="276"/>
+      </w:pPr>
+      <w:r>
+        <w:rPr>
+          <w:rFonts w:ascii="Arial" w:cs="Arial" w:eastAsia="Arial" w:hAnsi="Arial"/>
+          <w:i/>
+          <w:iCs/>
+          <w:color w:val="444444"/>
+          <w:sz w:val="21"/>
+          <w:szCs w:val="21"/>
+        </w:rPr>
+        <w:t xml:space="preserve">Der Durchschnittserlös liegt im ersten Jahr bei 600 Euro, im zweiten bei 620 und im dritten bei 640 Euro je Auftrag. Der Anstieg beruht allein darauf, dass sich der Auftragsmix zur Frist 2028 hin zum Paket Umstieg verschiebt: Betriebe ohne Rechnungsprogramm können bis zuletzt warten und müssen dann mehr umstellen. Die Preise selbst bleiben in der Planung unverändert.</w:t>
+      </w:r>
+    </w:p>
     <w:p>
       <w:pPr>
         <w:spacing w:after="160"/>

</xml_diff>